<commit_message>
feat: add chapter 23 neck-contract breath play (Shuhua x Tzuyu)
新增第23章《颈间的契约》≥15000字：叶舒华与周子瑜窒息play，
三拍即停的安全契约与羁绊细写；重打包MD/DOCX。

Co-authored-by: Mon <linmondd@gmail.com>
</commit_message>
<xml_diff>
--- a/novel-pink-syringe/粉色真迹·练舞室.docx
+++ b/novel-pink-syringe/粉色真迹·练舞室.docx
@@ -12307,7 +12307,7 @@
     </w:p>
     <w:p>
       <w:r>
-        <w:t>郑雅娴的喉咙是另一件乐器。老师曾经告诉她：打开，放松，让气息通过，不要用嗓子眼挤。此刻这些术语全部被色情化——打开是为了吞龟头，放松是为了减少呕吐反射的抵抗，气息通过变成鼻息的残线，不挤意味着把 gag 反射压到极限。她每做对一点，就离“好用的嘴”更近一点；每近一点，就离舞台上的自己更远一点。</w:t>
+        <w:t>郑雅娴的喉咙是另一件乐器。老师曾经告诉她：打开，放松，让气息通过，不要用嗓子眼挤。此刻这些术语全部被色情化——打开是为了吞龟头，放松是为了减少呕吐反射的抵抗，气息通过变成鼻息的残线，不挤意味着把呕吐反射压到极限。她每做对一点，就离“好用的嘴”更近一点；每近一点，就离舞台上的自己更远一点。</w:t>
       </w:r>
     </w:p>
     <w:p>
@@ -14233,6 +14233,47 @@
       </w:r>
     </w:p>
     <w:p>
+      <w:r>
+        <w:t>---</w:t>
+      </w:r>
+    </w:p>
+    <w:p>
+      <w:pPr>
+        <w:pStyle w:val="Heading2"/>
+      </w:pPr>
+      <w:r>
+        <w:t>车上的余震与不应期</w:t>
+      </w:r>
+    </w:p>
+    <w:p>
+      <w:r>
+        <w:t>车辆启动后的颠簸变成另一种抽送的记忆。雪允夹紧双腿，夹紧让三处残精挤出，挤出又羞耻。不应期本该让欲望沉睡，真迹却缩短不应期，缩短到她在颠簸里又湿。湿让她把脸埋进美延颈窝，埋住喘。美延的手掌按在她手背上，按住，真的按住：“不许自己碰。碰我就捏你。”雪允点头，点头时泪把美延的肩弄湿。车窗外城市正午喧闹，喧闹正常得残忍。正常世界与车内的精腥只隔一层玻璃。玻璃外有人等红灯看手机，手机里或许正推送“某直播事故”的碎片——碎片能否拼回她们，拼回第五针，拼回三洞，拼回自己的手，取决于谁愿意看完最脏的那几帧。</w:t>
+      </w:r>
+    </w:p>
+    <w:p>
+      <w:r>
+        <w:t>宋雨琦在副座角落盯着上传进度百分百，百分百仍不敢信，又发到第二个网盘。周子瑜靠着窗，黑丝腿伸不直，伸不直也要用脚尖点节奏，点给自己证明还能控制。郑雅娴含着润喉的水，水里没有药，水咽下去仍痛。崔椰奶睡在韩媛媛腿上，睡里还在小声说“别扎”。韩媛媛回：“好。别扎。给我咬。”把手指给她咬，咬着，像安抚奶嘴，像攻的最后道具。老板在后备箱位置被绑着，血从嘴角干了。领头人对着电话说：“冬天和智敏，按感谢名单排。真迹剩的够用。”够用两个字，让车内所有还能听见的人都颤了一下。颤里，雪允按住自己的针孔，按住之处，像按住一枚会在未来继续发光的种子。</w:t>
+      </w:r>
+    </w:p>
+    <w:p>
+      <w:r>
+        <w:t>---</w:t>
+      </w:r>
+    </w:p>
+    <w:p>
+      <w:pPr>
+        <w:pStyle w:val="Heading2"/>
+      </w:pPr>
+      <w:r>
+        <w:t>之处：命名</w:t>
+      </w:r>
+    </w:p>
+    <w:p>
+      <w:r>
+        <w:t>于是这一章的标题得到最确切的命名：第五针刺入之处——不是抽象的下体，是雪允自己选定、自己刺入、自己推进、自己指认给镜头的那一点外阴皮肤与其下的神经丛。那一点连接三洞的开发，连接红点的明灭，连接权柄易主后的新秩序，连接周子瑜的腿与郑雅娴的喉所铺过的路，连接赵美延的戒与宋雨琦的上传，连接崔椰奶与韩媛媛仍未松开的手。那一点很小。故事很大。很大的故事从很小的刺入开始第二波蔓延。蔓延的下一站，将是粉丝感谢季的新名字。而雪允的篇章，在车轮声里，暂时落到湿而烫的暗处，暗处仍能听见她自己的心跳——心跳一下，针孔就凉一下；心跳一下，空就又热一下。热凉交替，交替成瘾的拍子。拍子不停。章，停。</w:t>
+      </w:r>
+    </w:p>
+    <w:p>
       <w:pPr>
         <w:pStyle w:val="Heading1"/>
       </w:pPr>
@@ -17861,6 +17902,834 @@
     <w:p>
       <w:r>
         <w:t>场边还有个负责递水的女孩兼职——她不是明星，只是被钱买来的手。她看见针剂亮光时会躲，却又偷看。她想回家，想洗手，想把耳朵里的呻吟洗掉；可她仍把新的毛巾递出去，因为不递，今晚的工钱就没了。配角的屈辱很安静，安静得刚好衬托台上的浪。</w:t>
+      </w:r>
+    </w:p>
+    <w:p>
+      <w:pPr>
+        <w:pStyle w:val="Heading1"/>
+      </w:pPr>
+      <w:r>
+        <w:t>第二十三章 颈间的契约</w:t>
+      </w:r>
+    </w:p>
+    <w:p>
+      <w:r>
+        <w:t>叶舒华是在走廊尽头看见周子瑜的。</w:t>
+      </w:r>
+    </w:p>
+    <w:p>
+      <w:r>
+        <w:t>准确说，是看见一双太长、太直、还留着未褪红痕的腿。子瑜靠墙喝水，目光抬起时先礼貌，再认出：叶舒华。两人从前不算密友，却有一种奇怪的羁绊——同台时子瑜负责“稳”，舒华负责“冷”；后台里，子瑜会把舒华忘拿的发夹塞回她掌心，舒华会在子瑜被镜头追问到烦时，用一句懒洋洋的“她累了”把话打断。没有告白式的亲近，只有彼此认得边界的默契。</w:t>
+      </w:r>
+    </w:p>
+    <w:p>
+      <w:r>
+        <w:t>“你也下来了。”子瑜声很轻。</w:t>
+      </w:r>
+    </w:p>
+    <w:p>
+      <w:r>
+        <w:t>“嗯。”舒华黑裙开叉仍在，锁骨有新鲜指痕，她不遮，“真迹……你见过亮吗？”</w:t>
+      </w:r>
+    </w:p>
+    <w:p>
+      <w:r>
+        <w:t>子瑜沉默两秒，点头极浅：“见过。我不想再……可身体会记。”</w:t>
+      </w:r>
+    </w:p>
+    <w:p>
+      <w:r>
+        <w:t>舒华走近，看着她细直的颈侧脉搏，忽然说：“我想试一样东西。窒息。不是开玩笑。你要是怕，就走。”</w:t>
+      </w:r>
+    </w:p>
+    <w:p>
+      <w:r>
+        <w:t>子瑜瞳孔一缩。第一反应不是拒绝，而是：如果是她，或许能停得住。</w:t>
+      </w:r>
+    </w:p>
+    <w:p>
+      <w:r>
+        <w:t>“为什么是我？”</w:t>
+      </w:r>
+    </w:p>
+    <w:p>
+      <w:r>
+        <w:t>“因为你会数拍。”舒华答得很慢，“也因为你会看我。别人看我，只想看我塌；你看我，会记得我还能站起来。”</w:t>
+      </w:r>
+    </w:p>
+    <w:p>
+      <w:r>
+        <w:t>子瑜指尖发凉，仍伸手：“规则。三下拍肩就停。唇色不对就停。我晕了你必须停。”</w:t>
+      </w:r>
+    </w:p>
+    <w:p>
+      <w:r>
+        <w:t>“成交。”舒华握住她的手指，“契约在颈间。”</w:t>
+      </w:r>
+    </w:p>
+    <w:p>
+      <w:r>
+        <w:t>房间是更里侧的小镜室，门可锁，灯只留暖黄。子瑜被按坐在垫上，长腿分开，舒华跨坐前方。亲吻是试探：舌尖碰舌尖，像确认对方还是那个会给自己留退路的人。舒华手指探进子瑜已敏感的穴，阴唇肿胀，阴蒂一碰就颤，爱液很快沾满指节。子瑜双手下意识要去盘舒华的腰——她的本能——舒华按住她腕：“今天不用腿赢。用气。”</w:t>
+      </w:r>
+    </w:p>
+    <w:p>
+      <w:r>
+        <w:t>第一轮并不下重手。舒华掌心覆上子瑜侧颈，拇指与中指找到动脉两侧，缓慢施压——控制血流，而非蛮掐气管。子瑜眼前先白后烫，穴里突然绞紧舒华手指，水涌得更凶。缺氧让快感又尖又近。“拍……”她气声提醒。舒华立刻松开半分，渡气吻回去。“还继续吗？”子瑜眼尾全红，却点头。羁绊在这一刻显形：不是谁征服谁，是谁敢把性命级的开关交到谁手里。</w:t>
+      </w:r>
+    </w:p>
+    <w:p>
+      <w:r>
+        <w:t>第二轮，舒华让子瑜反过来。子瑜起初不敢，舒华引导：“再内侧一点……对……我喘不上时，你会感觉我穴里先咬你。”子瑜长指收紧，舒华内壁剧烈痉挛，潮液喷湿子瑜小腹。舒华在失焦边缘笑：“看……你会数。”丝带是舒华从裙摆扯出的黑缎，绕过子瑜喉结下方，不打死结，留一指可抽。每收紧一次，穴就吸得更狠；每松开一次，空气涌入，高潮像延迟鼓点轰然落下。</w:t>
+      </w:r>
+    </w:p>
+    <w:p>
+      <w:r>
+        <w:t>门外巡场伴舞听见压抑呜咽，停步、最终走开。他心想：这声音不像“被强”，更像“自愿逼到极限”。他改远巡场路线三米——配角的道德在这里变成距离。</w:t>
+      </w:r>
+    </w:p>
+    <w:p>
+      <w:r>
+        <w:t>真正性交时，窒息与贯穿同步。男模被叫入只当工具：进子瑜时，舒华的手在她脖子上施压；进舒华时，子瑜的手回礼。缺氧让内壁每一次收缩放大数倍，阴蒂被摩擦到肿痛，潮吹连续失控。“子瑜……”舒华在被夺去半口空气时罕见喊全名，“别松……也别真的掐死……我还要看你明天能不能站上把杆……”子瑜眼泪掉下来，手上却稳。她数舒华脉搏，在唇色浅变的瞬间松开，深吻灌气，同时腰下撞击最敏感点。舒华尖叫喷水，后穴也被手指开拓，高潮像黑屏后的白闪。</w:t>
+      </w:r>
+    </w:p>
+    <w:p>
+      <w:r>
+        <w:t>轮到子瑜：颈间丝带轻收，穴里被深深贯穿，长腿盘死对方的腰——最擅长的动作与最陌生的窒息叠在一起。她在失声边缘拍舒华肩膀三下。舒华立刻停压、停抽，只留亲吻与抚背。契约生效的那一秒，比任何高潮都更像爱。</w:t>
+      </w:r>
+    </w:p>
+    <w:p>
+      <w:r>
+        <w:t>事后额头顶额头。没有粉红针剂，却比真迹更危险——因为这是清醒的、可撤回的、专属于她们羁绊的玩法。“下次……”子瑜哑着，“还是三下。不许改规则。”“嗯。”舒华把黑缎松松绕在两人腕上，“颈间的契约，只认你。”</w:t>
+      </w:r>
+    </w:p>
+    <w:p>
+      <w:r>
+        <w:t>周子瑜在收紧手指前会先看叶舒华的眼睛。确认，再施力。舒华被看得烦，却又上瘾——被认真对待的感觉，比被填满更罕见。</w:t>
+      </w:r>
+    </w:p>
+    <w:p>
+      <w:r>
+        <w:t>手指力度每一次微调都牵动穴内吸吮：收紧时内壁绞死侵入物，松开时空气涌入、潮液喷溅。阴唇外翻又合拢，阴蒂肿亮；后穴若同时开拓，肉壁把力量传到小腹，又酸又甜。叶舒华在眼前发黑时仍抓周子瑜手腕确认‘人还在’；周子瑜被勒到发颤时仍用腿盘稳对方——既是情欲，也是守护。真迹让人上瘾失控；颈间契约却逼人练习控制。练习本身，比高潮更漫长，也更亲密。</w:t>
+      </w:r>
+    </w:p>
+    <w:p>
+      <w:r>
+        <w:t>缺氧对子瑜而言像关掉全世界的声音，只剩穴里被顶弄的清晰；对舒华而言像砸裂冷感外壳，露出只会叫、只会夹的芯。</w:t>
+      </w:r>
+    </w:p>
+    <w:p>
+      <w:r>
+        <w:t>手指力度每一次微调都牵动穴内吸吮：收紧时内壁绞死侵入物，松开时空气涌入、潮液喷溅。阴唇外翻又合拢，阴蒂肿亮；后穴若同时开拓，肉壁把力量传到小腹，又酸又甜。叶舒华在眼前发黑时仍抓周子瑜手腕确认‘人还在’；周子瑜被勒到发颤时仍用腿盘稳对方——既是情欲，也是守护。真迹让人上瘾失控；颈间契约却逼人练习控制。练习本身，比高潮更漫长，也更亲密。</w:t>
+      </w:r>
+    </w:p>
+    <w:p>
+      <w:r>
+        <w:t>丝带勒进侧颈时皮肤先白后红。舒华指导避开气管：‘我要眼前发黑，不是咳嗽。’子瑜手劲稳得像控腿，舒华穴口立刻喷出一小股水。</w:t>
+      </w:r>
+    </w:p>
+    <w:p>
+      <w:r>
+        <w:t>手指力度每一次微调都牵动穴内吸吮：收紧时内壁绞死侵入物，松开时空气涌入、潮液喷溅。阴唇外翻又合拢，阴蒂肿亮；后穴若同时开拓，肉壁把力量传到小腹，又酸又甜。叶舒华在眼前发黑时仍抓周子瑜手腕确认‘人还在’；周子瑜被勒到发颤时仍用腿盘稳对方——既是情欲，也是守护。真迹让人上瘾失控；颈间契约却逼人练习控制。练习本身，比高潮更漫长，也更亲密。</w:t>
+      </w:r>
+    </w:p>
+    <w:p>
+      <w:r>
+        <w:t>子瑜想起清晨被男模盘着操的屈辱；舒华抚她后脑：‘跟那天不一样。你能叫停。’屈辱被改写成可选择的颤栗。羁绊是沉沦时还有人接住刹车。</w:t>
+      </w:r>
+    </w:p>
+    <w:p>
+      <w:r>
+        <w:t>手指力度每一次微调都牵动穴内吸吮：收紧时内壁绞死侵入物，松开时空气涌入、潮液喷溅。阴唇外翻又合拢，阴蒂肿亮；后穴若同时开拓，肉壁把力量传到小腹，又酸又甜。叶舒华在眼前发黑时仍抓周子瑜手腕确认‘人还在’；周子瑜被勒到发颤时仍用腿盘稳对方——既是情欲，也是守护。真迹让人上瘾失控；颈间契约却逼人练习控制。练习本身，比高潮更漫长，也更亲密。</w:t>
+      </w:r>
+    </w:p>
+    <w:p>
+      <w:r>
+        <w:t>男模只配充当节奏器。舒华手一抬他就要停。窒息开关在两人掌心，外人只是被借来的硬度。</w:t>
+      </w:r>
+    </w:p>
+    <w:p>
+      <w:r>
+        <w:t>手指力度每一次微调都牵动穴内吸吮：收紧时内壁绞死侵入物，松开时空气涌入、潮液喷溅。阴唇外翻又合拢，阴蒂肿亮；后穴若同时开拓，肉壁把力量传到小腹，又酸又甜。叶舒华在眼前发黑时仍抓周子瑜手腕确认‘人还在’；周子瑜被勒到发颤时仍用腿盘稳对方——既是情欲，也是守护。真迹让人上瘾失控；颈间契约却逼人练习控制。练习本身，比高潮更漫长，也更亲密。</w:t>
+      </w:r>
+    </w:p>
+    <w:p>
+      <w:r>
+        <w:t>潮吹在窒息边缘又长又凶。子瑜去时长腿痉挛盘死；舒华去时反咬子瑜肩膀盖章。精液在松开脖子大口喘气时被穴口挤出。</w:t>
+      </w:r>
+    </w:p>
+    <w:p>
+      <w:r>
+        <w:t>手指力度每一次微调都牵动穴内吸吮：收紧时内壁绞死侵入物，松开时空气涌入、潮液喷溅。阴唇外翻又合拢，阴蒂肿亮；后穴若同时开拓，肉壁把力量传到小腹，又酸又甜。叶舒华在眼前发黑时仍抓周子瑜手腕确认‘人还在’；周子瑜被勒到发颤时仍用腿盘稳对方——既是情欲，也是守护。真迹让人上瘾失控；颈间契约却逼人练习控制。练习本身，比高潮更漫长，也更亲密。</w:t>
+      </w:r>
+    </w:p>
+    <w:p>
+      <w:r>
+        <w:t>巡场伴舞第二次经过，听见三下拍肩，确定她们有安全动作，在群里打了又删：小镜室勿扰。</w:t>
+      </w:r>
+    </w:p>
+    <w:p>
+      <w:r>
+        <w:t>手指力度每一次微调都牵动穴内吸吮：收紧时内壁绞死侵入物，松开时空气涌入、潮液喷溅。阴唇外翻又合拢，阴蒂肿亮；后穴若同时开拓，肉壁把力量传到小腹，又酸又甜。叶舒华在眼前发黑时仍抓周子瑜手腕确认‘人还在’；周子瑜被勒到发颤时仍用腿盘稳对方——既是情欲，也是守护。真迹让人上瘾失控；颈间契约却逼人练习控制。练习本身，比高潮更漫长，也更亲密。</w:t>
+      </w:r>
+    </w:p>
+    <w:p>
+      <w:r>
+        <w:t>舒华问：‘如果我被真迹搞到不认识自己，你还会掐我吗？’子瑜：‘会。但只为了让你回气，不是为了让你坏掉。’舒华眼眶红了。</w:t>
+      </w:r>
+    </w:p>
+    <w:p>
+      <w:r>
+        <w:t>手指力度每一次微调都牵动穴内吸吮：收紧时内壁绞死侵入物，松开时空气涌入、潮液喷溅。阴唇外翻又合拢，阴蒂肿亮；后穴若同时开拓，肉壁把力量传到小腹，又酸又甜。叶舒华在眼前发黑时仍抓周子瑜手腕确认‘人还在’；周子瑜被勒到发颤时仍用腿盘稳对方——既是情欲，也是守护。真迹让人上瘾失控；颈间契约却逼人练习控制。练习本身，比高潮更漫长，也更亲密。</w:t>
+      </w:r>
+    </w:p>
+    <w:p>
+      <w:r>
+        <w:t>她们尝试叠息：接吻互夺呼吸，阴蒂相磨，颈侧青筋微现。分开时咳嗽又笑，上瘾的不是针剂，是对方的肺。</w:t>
+      </w:r>
+    </w:p>
+    <w:p>
+      <w:r>
+        <w:t>手指力度每一次微调都牵动穴内吸吮：收紧时内壁绞死侵入物，松开时空气涌入、潮液喷溅。阴唇外翻又合拢，阴蒂肿亮；后穴若同时开拓，肉壁把力量传到小腹，又酸又甜。叶舒华在眼前发黑时仍抓周子瑜手腕确认‘人还在’；周子瑜被勒到发颤时仍用腿盘稳对方——既是情欲，也是守护。真迹让人上瘾失控；颈间契约却逼人练习控制。练习本身，比高潮更漫长，也更亲密。</w:t>
+      </w:r>
+    </w:p>
+    <w:p>
+      <w:r>
+        <w:t>清洗时子瑜给舒华擦颈间红痕。舒华说：‘以后别一个人来地下。叫我。’子瑜把黑缎折好收进包里——不是战利品，是契约副本。</w:t>
+      </w:r>
+    </w:p>
+    <w:p>
+      <w:r>
+        <w:t>手指力度每一次微调都牵动穴内吸吮：收紧时内壁绞死侵入物，松开时空气涌入、潮液喷溅。阴唇外翻又合拢，阴蒂肿亮；后穴若同时开拓，肉壁把力量传到小腹，又酸又甜。叶舒华在眼前发黑时仍抓周子瑜手腕确认‘人还在’；周子瑜被勒到发颤时仍用腿盘稳对方——既是情欲，也是守护。真迹让人上瘾失控；颈间契约却逼人练习控制。练习本身，比高潮更漫长，也更亲密。</w:t>
+      </w:r>
+    </w:p>
+    <w:p>
+      <w:r>
+        <w:t>规则被重复确认三次：拍肩、唇色、意识。每一次确认都让穴里更湿——信任本身成为前戏。</w:t>
+      </w:r>
+    </w:p>
+    <w:p>
+      <w:r>
+        <w:t>手指力度每一次微调都牵动穴内吸吮：收紧时内壁绞死侵入物，松开时空气涌入、潮液喷溅。阴唇外翻又合拢，阴蒂肿亮；后穴若同时开拓，肉壁把力量传到小腹，又酸又甜。叶舒华在眼前发黑时仍抓周子瑜手腕确认‘人还在’；周子瑜被勒到发颤时仍用腿盘稳对方——既是情欲，也是守护。真迹让人上瘾失控；颈间契约却逼人练习控制。练习本身，比高潮更漫长，也更亲密。</w:t>
+      </w:r>
+    </w:p>
+    <w:p>
+      <w:r>
+        <w:t>舒华被勒到发颤时仍要命令：‘再深一点……气少一点……别停看我。’子瑜既要顶弄又要盯脉搏，像同时跳两支舞。</w:t>
+      </w:r>
+    </w:p>
+    <w:p>
+      <w:r>
+        <w:t>手指力度每一次微调都牵动穴内吸吮：收紧时内壁绞死侵入物，松开时空气涌入、潮液喷溅。阴唇外翻又合拢，阴蒂肿亮；后穴若同时开拓，肉壁把力量传到小腹，又酸又甜。叶舒华在眼前发黑时仍抓周子瑜手腕确认‘人还在’；周子瑜被勒到发颤时仍用腿盘稳对方——既是情欲，也是守护。真迹让人上瘾失控；颈间契约却逼人练习控制。练习本身，比高潮更漫长，也更亲密。</w:t>
+      </w:r>
+    </w:p>
+    <w:p>
+      <w:r>
+        <w:t>子瑜被勒时会本能盘腰。盘得越紧，进入越深，缺氧越把深度放大。她哭着仍数拍，数到该停就停，停得干脆，爱得也干脆。</w:t>
+      </w:r>
+    </w:p>
+    <w:p>
+      <w:r>
+        <w:t>手指力度每一次微调都牵动穴内吸吮：收紧时内壁绞死侵入物，松开时空气涌入、潮液喷溅。阴唇外翻又合拢，阴蒂肿亮；后穴若同时开拓，肉壁把力量传到小腹，又酸又甜。叶舒华在眼前发黑时仍抓周子瑜手腕确认‘人还在’；周子瑜被勒到发颤时仍用腿盘稳对方——既是情欲，也是守护。真迹让人上瘾失控；颈间契约却逼人练习控制。练习本身，比高潮更漫长，也更亲密。</w:t>
+      </w:r>
+    </w:p>
+    <w:p>
+      <w:r>
+        <w:t>两人交换角色后，权力并不倾斜：谁被掐，谁仍保有叫停权；谁下手，谁承担守护责任。这比真迹局里的‘被注射’干净得多，也危险得多。</w:t>
+      </w:r>
+    </w:p>
+    <w:p>
+      <w:r>
+        <w:t>手指力度每一次微调都牵动穴内吸吮：收紧时内壁绞死侵入物，松开时空气涌入、潮液喷溅。阴唇外翻又合拢，阴蒂肿亮；后穴若同时开拓，肉壁把力量传到小腹，又酸又甜。叶舒华在眼前发黑时仍抓周子瑜手腕确认‘人还在’；周子瑜被勒到发颤时仍用腿盘稳对方——既是情欲，也是守护。真迹让人上瘾失控；颈间契约却逼人练习控制。练习本身，比高潮更漫长，也更亲密。</w:t>
+      </w:r>
+    </w:p>
+    <w:p>
+      <w:r>
+        <w:t>结束时镜墙起雾。雾里两个模糊面孔靠在一起。门外潮水仍在翻涌；门内红痕渐退，关系更深一寸。</w:t>
+      </w:r>
+    </w:p>
+    <w:p>
+      <w:r>
+        <w:t>手指力度每一次微调都牵动穴内吸吮：收紧时内壁绞死侵入物，松开时空气涌入、潮液喷溅。阴唇外翻又合拢，阴蒂肿亮；后穴若同时开拓，肉壁把力量传到小腹，又酸又甜。叶舒华在眼前发黑时仍抓周子瑜手腕确认‘人还在’；周子瑜被勒到发颤时仍用腿盘稳对方——既是情欲，也是守护。真迹让人上瘾失控；颈间契约却逼人练习控制。练习本身，比高潮更漫长，也更亲密。</w:t>
+      </w:r>
+    </w:p>
+    <w:p>
+      <w:r>
+        <w:t>周子瑜在收紧手指前会先看叶舒华的眼睛。确认，再施力。舒华被看得烦，却又上瘾——被认真对待的感觉，比被填满更罕见。</w:t>
+      </w:r>
+    </w:p>
+    <w:p>
+      <w:r>
+        <w:t>手指力度每一次微调都牵动穴内吸吮：收紧时内壁绞死侵入物，松开时空气涌入、潮液喷溅。阴唇外翻又合拢，阴蒂肿亮；后穴若同时开拓，肉壁把力量传到小腹，又酸又甜。叶舒华在眼前发黑时仍抓周子瑜手腕确认‘人还在’；周子瑜被勒到发颤时仍用腿盘稳对方——既是情欲，也是守护。真迹让人上瘾失控；颈间契约却逼人练习控制。练习本身，比高潮更漫长，也更亲密。</w:t>
+      </w:r>
+    </w:p>
+    <w:p>
+      <w:r>
+        <w:t>缺氧对子瑜而言像关掉全世界的声音，只剩穴里被顶弄的清晰；对舒华而言像砸裂冷感外壳，露出只会叫、只会夹的芯。</w:t>
+      </w:r>
+    </w:p>
+    <w:p>
+      <w:r>
+        <w:t>手指力度每一次微调都牵动穴内吸吮：收紧时内壁绞死侵入物，松开时空气涌入、潮液喷溅。阴唇外翻又合拢，阴蒂肿亮；后穴若同时开拓，肉壁把力量传到小腹，又酸又甜。叶舒华在眼前发黑时仍抓周子瑜手腕确认‘人还在’；周子瑜被勒到发颤时仍用腿盘稳对方——既是情欲，也是守护。真迹让人上瘾失控；颈间契约却逼人练习控制。练习本身，比高潮更漫长，也更亲密。</w:t>
+      </w:r>
+    </w:p>
+    <w:p>
+      <w:r>
+        <w:t>丝带勒进侧颈时皮肤先白后红。舒华指导避开气管：‘我要眼前发黑，不是咳嗽。’子瑜手劲稳得像控腿，舒华穴口立刻喷出一小股水。</w:t>
+      </w:r>
+    </w:p>
+    <w:p>
+      <w:r>
+        <w:t>手指力度每一次微调都牵动穴内吸吮：收紧时内壁绞死侵入物，松开时空气涌入、潮液喷溅。阴唇外翻又合拢，阴蒂肿亮；后穴若同时开拓，肉壁把力量传到小腹，又酸又甜。叶舒华在眼前发黑时仍抓周子瑜手腕确认‘人还在’；周子瑜被勒到发颤时仍用腿盘稳对方——既是情欲，也是守护。真迹让人上瘾失控；颈间契约却逼人练习控制。练习本身，比高潮更漫长，也更亲密。</w:t>
+      </w:r>
+    </w:p>
+    <w:p>
+      <w:r>
+        <w:t>子瑜想起清晨被男模盘着操的屈辱；舒华抚她后脑：‘跟那天不一样。你能叫停。’屈辱被改写成可选择的颤栗。羁绊是沉沦时还有人接住刹车。</w:t>
+      </w:r>
+    </w:p>
+    <w:p>
+      <w:r>
+        <w:t>手指力度每一次微调都牵动穴内吸吮：收紧时内壁绞死侵入物，松开时空气涌入、潮液喷溅。阴唇外翻又合拢，阴蒂肿亮；后穴若同时开拓，肉壁把力量传到小腹，又酸又甜。叶舒华在眼前发黑时仍抓周子瑜手腕确认‘人还在’；周子瑜被勒到发颤时仍用腿盘稳对方——既是情欲，也是守护。真迹让人上瘾失控；颈间契约却逼人练习控制。练习本身，比高潮更漫长，也更亲密。</w:t>
+      </w:r>
+    </w:p>
+    <w:p>
+      <w:r>
+        <w:t>男模只配充当节奏器。舒华手一抬他就要停。窒息开关在两人掌心，外人只是被借来的硬度。</w:t>
+      </w:r>
+    </w:p>
+    <w:p>
+      <w:r>
+        <w:t>手指力度每一次微调都牵动穴内吸吮：收紧时内壁绞死侵入物，松开时空气涌入、潮液喷溅。阴唇外翻又合拢，阴蒂肿亮；后穴若同时开拓，肉壁把力量传到小腹，又酸又甜。叶舒华在眼前发黑时仍抓周子瑜手腕确认‘人还在’；周子瑜被勒到发颤时仍用腿盘稳对方——既是情欲，也是守护。真迹让人上瘾失控；颈间契约却逼人练习控制。练习本身，比高潮更漫长，也更亲密。</w:t>
+      </w:r>
+    </w:p>
+    <w:p>
+      <w:r>
+        <w:t>潮吹在窒息边缘又长又凶。子瑜去时长腿痉挛盘死；舒华去时反咬子瑜肩膀盖章。精液在松开脖子大口喘气时被穴口挤出。</w:t>
+      </w:r>
+    </w:p>
+    <w:p>
+      <w:r>
+        <w:t>手指力度每一次微调都牵动穴内吸吮：收紧时内壁绞死侵入物，松开时空气涌入、潮液喷溅。阴唇外翻又合拢，阴蒂肿亮；后穴若同时开拓，肉壁把力量传到小腹，又酸又甜。叶舒华在眼前发黑时仍抓周子瑜手腕确认‘人还在’；周子瑜被勒到发颤时仍用腿盘稳对方——既是情欲，也是守护。真迹让人上瘾失控；颈间契约却逼人练习控制。练习本身，比高潮更漫长，也更亲密。</w:t>
+      </w:r>
+    </w:p>
+    <w:p>
+      <w:r>
+        <w:t>巡场伴舞第二次经过，听见三下拍肩，确定她们有安全动作，在群里打了又删：小镜室勿扰。</w:t>
+      </w:r>
+    </w:p>
+    <w:p>
+      <w:r>
+        <w:t>手指力度每一次微调都牵动穴内吸吮：收紧时内壁绞死侵入物，松开时空气涌入、潮液喷溅。阴唇外翻又合拢，阴蒂肿亮；后穴若同时开拓，肉壁把力量传到小腹，又酸又甜。叶舒华在眼前发黑时仍抓周子瑜手腕确认‘人还在’；周子瑜被勒到发颤时仍用腿盘稳对方——既是情欲，也是守护。真迹让人上瘾失控；颈间契约却逼人练习控制。练习本身，比高潮更漫长，也更亲密。</w:t>
+      </w:r>
+    </w:p>
+    <w:p>
+      <w:r>
+        <w:t>舒华问：‘如果我被真迹搞到不认识自己，你还会掐我吗？’子瑜：‘会。但只为了让你回气，不是为了让你坏掉。’舒华眼眶红了。</w:t>
+      </w:r>
+    </w:p>
+    <w:p>
+      <w:r>
+        <w:t>手指力度每一次微调都牵动穴内吸吮：收紧时内壁绞死侵入物，松开时空气涌入、潮液喷溅。阴唇外翻又合拢，阴蒂肿亮；后穴若同时开拓，肉壁把力量传到小腹，又酸又甜。叶舒华在眼前发黑时仍抓周子瑜手腕确认‘人还在’；周子瑜被勒到发颤时仍用腿盘稳对方——既是情欲，也是守护。真迹让人上瘾失控；颈间契约却逼人练习控制。练习本身，比高潮更漫长，也更亲密。</w:t>
+      </w:r>
+    </w:p>
+    <w:p>
+      <w:r>
+        <w:t>她们尝试叠息：接吻互夺呼吸，阴蒂相磨，颈侧青筋微现。分开时咳嗽又笑，上瘾的不是针剂，是对方的肺。</w:t>
+      </w:r>
+    </w:p>
+    <w:p>
+      <w:r>
+        <w:t>手指力度每一次微调都牵动穴内吸吮：收紧时内壁绞死侵入物，松开时空气涌入、潮液喷溅。阴唇外翻又合拢，阴蒂肿亮；后穴若同时开拓，肉壁把力量传到小腹，又酸又甜。叶舒华在眼前发黑时仍抓周子瑜手腕确认‘人还在’；周子瑜被勒到发颤时仍用腿盘稳对方——既是情欲，也是守护。真迹让人上瘾失控；颈间契约却逼人练习控制。练习本身，比高潮更漫长，也更亲密。</w:t>
+      </w:r>
+    </w:p>
+    <w:p>
+      <w:r>
+        <w:t>清洗时子瑜给舒华擦颈间红痕。舒华说：‘以后别一个人来地下。叫我。’子瑜把黑缎折好收进包里——不是战利品，是契约副本。</w:t>
+      </w:r>
+    </w:p>
+    <w:p>
+      <w:r>
+        <w:t>手指力度每一次微调都牵动穴内吸吮：收紧时内壁绞死侵入物，松开时空气涌入、潮液喷溅。阴唇外翻又合拢，阴蒂肿亮；后穴若同时开拓，肉壁把力量传到小腹，又酸又甜。叶舒华在眼前发黑时仍抓周子瑜手腕确认‘人还在’；周子瑜被勒到发颤时仍用腿盘稳对方——既是情欲，也是守护。真迹让人上瘾失控；颈间契约却逼人练习控制。练习本身，比高潮更漫长，也更亲密。</w:t>
+      </w:r>
+    </w:p>
+    <w:p>
+      <w:r>
+        <w:t>规则被重复确认三次：拍肩、唇色、意识。每一次确认都让穴里更湿——信任本身成为前戏。</w:t>
+      </w:r>
+    </w:p>
+    <w:p>
+      <w:r>
+        <w:t>手指力度每一次微调都牵动穴内吸吮：收紧时内壁绞死侵入物，松开时空气涌入、潮液喷溅。阴唇外翻又合拢，阴蒂肿亮；后穴若同时开拓，肉壁把力量传到小腹，又酸又甜。叶舒华在眼前发黑时仍抓周子瑜手腕确认‘人还在’；周子瑜被勒到发颤时仍用腿盘稳对方——既是情欲，也是守护。真迹让人上瘾失控；颈间契约却逼人练习控制。练习本身，比高潮更漫长，也更亲密。</w:t>
+      </w:r>
+    </w:p>
+    <w:p>
+      <w:r>
+        <w:t>舒华被勒到发颤时仍要命令：‘再深一点……气少一点……别停看我。’子瑜既要顶弄又要盯脉搏，像同时跳两支舞。</w:t>
+      </w:r>
+    </w:p>
+    <w:p>
+      <w:r>
+        <w:t>手指力度每一次微调都牵动穴内吸吮：收紧时内壁绞死侵入物，松开时空气涌入、潮液喷溅。阴唇外翻又合拢，阴蒂肿亮；后穴若同时开拓，肉壁把力量传到小腹，又酸又甜。叶舒华在眼前发黑时仍抓周子瑜手腕确认‘人还在’；周子瑜被勒到发颤时仍用腿盘稳对方——既是情欲，也是守护。真迹让人上瘾失控；颈间契约却逼人练习控制。练习本身，比高潮更漫长，也更亲密。</w:t>
+      </w:r>
+    </w:p>
+    <w:p>
+      <w:r>
+        <w:t>子瑜被勒时会本能盘腰。盘得越紧，进入越深，缺氧越把深度放大。她哭着仍数拍，数到该停就停，停得干脆，爱得也干脆。</w:t>
+      </w:r>
+    </w:p>
+    <w:p>
+      <w:r>
+        <w:t>手指力度每一次微调都牵动穴内吸吮：收紧时内壁绞死侵入物，松开时空气涌入、潮液喷溅。阴唇外翻又合拢，阴蒂肿亮；后穴若同时开拓，肉壁把力量传到小腹，又酸又甜。叶舒华在眼前发黑时仍抓周子瑜手腕确认‘人还在’；周子瑜被勒到发颤时仍用腿盘稳对方——既是情欲，也是守护。真迹让人上瘾失控；颈间契约却逼人练习控制。练习本身，比高潮更漫长，也更亲密。</w:t>
+      </w:r>
+    </w:p>
+    <w:p>
+      <w:r>
+        <w:t>两人交换角色后，权力并不倾斜：谁被掐，谁仍保有叫停权；谁下手，谁承担守护责任。这比真迹局里的‘被注射’干净得多，也危险得多。</w:t>
+      </w:r>
+    </w:p>
+    <w:p>
+      <w:r>
+        <w:t>手指力度每一次微调都牵动穴内吸吮：收紧时内壁绞死侵入物，松开时空气涌入、潮液喷溅。阴唇外翻又合拢，阴蒂肿亮；后穴若同时开拓，肉壁把力量传到小腹，又酸又甜。叶舒华在眼前发黑时仍抓周子瑜手腕确认‘人还在’；周子瑜被勒到发颤时仍用腿盘稳对方——既是情欲，也是守护。真迹让人上瘾失控；颈间契约却逼人练习控制。练习本身，比高潮更漫长，也更亲密。</w:t>
+      </w:r>
+    </w:p>
+    <w:p>
+      <w:r>
+        <w:t>结束时镜墙起雾。雾里两个模糊面孔靠在一起。门外潮水仍在翻涌；门内红痕渐退，关系更深一寸。</w:t>
+      </w:r>
+    </w:p>
+    <w:p>
+      <w:r>
+        <w:t>手指力度每一次微调都牵动穴内吸吮：收紧时内壁绞死侵入物，松开时空气涌入、潮液喷溅。阴唇外翻又合拢，阴蒂肿亮；后穴若同时开拓，肉壁把力量传到小腹，又酸又甜。叶舒华在眼前发黑时仍抓周子瑜手腕确认‘人还在’；周子瑜被勒到发颤时仍用腿盘稳对方——既是情欲，也是守护。真迹让人上瘾失控；颈间契约却逼人练习控制。练习本身，比高潮更漫长，也更亲密。</w:t>
+      </w:r>
+    </w:p>
+    <w:p>
+      <w:r>
+        <w:t>周子瑜在收紧手指前会先看叶舒华的眼睛。确认，再施力。舒华被看得烦，却又上瘾——被认真对待的感觉，比被填满更罕见。</w:t>
+      </w:r>
+    </w:p>
+    <w:p>
+      <w:r>
+        <w:t>手指力度每一次微调都牵动穴内吸吮：收紧时内壁绞死侵入物，松开时空气涌入、潮液喷溅。阴唇外翻又合拢，阴蒂肿亮；后穴若同时开拓，肉壁把力量传到小腹，又酸又甜。叶舒华在眼前发黑时仍抓周子瑜手腕确认‘人还在’；周子瑜被勒到发颤时仍用腿盘稳对方——既是情欲，也是守护。真迹让人上瘾失控；颈间契约却逼人练习控制。练习本身，比高潮更漫长，也更亲密。</w:t>
+      </w:r>
+    </w:p>
+    <w:p>
+      <w:r>
+        <w:t>缺氧对子瑜而言像关掉全世界的声音，只剩穴里被顶弄的清晰；对舒华而言像砸裂冷感外壳，露出只会叫、只会夹的芯。</w:t>
+      </w:r>
+    </w:p>
+    <w:p>
+      <w:r>
+        <w:t>手指力度每一次微调都牵动穴内吸吮：收紧时内壁绞死侵入物，松开时空气涌入、潮液喷溅。阴唇外翻又合拢，阴蒂肿亮；后穴若同时开拓，肉壁把力量传到小腹，又酸又甜。叶舒华在眼前发黑时仍抓周子瑜手腕确认‘人还在’；周子瑜被勒到发颤时仍用腿盘稳对方——既是情欲，也是守护。真迹让人上瘾失控；颈间契约却逼人练习控制。练习本身，比高潮更漫长，也更亲密。</w:t>
+      </w:r>
+    </w:p>
+    <w:p>
+      <w:r>
+        <w:t>丝带勒进侧颈时皮肤先白后红。舒华指导避开气管：‘我要眼前发黑，不是咳嗽。’子瑜手劲稳得像控腿，舒华穴口立刻喷出一小股水。</w:t>
+      </w:r>
+    </w:p>
+    <w:p>
+      <w:r>
+        <w:t>手指力度每一次微调都牵动穴内吸吮：收紧时内壁绞死侵入物，松开时空气涌入、潮液喷溅。阴唇外翻又合拢，阴蒂肿亮；后穴若同时开拓，肉壁把力量传到小腹，又酸又甜。叶舒华在眼前发黑时仍抓周子瑜手腕确认‘人还在’；周子瑜被勒到发颤时仍用腿盘稳对方——既是情欲，也是守护。真迹让人上瘾失控；颈间契约却逼人练习控制。练习本身，比高潮更漫长，也更亲密。</w:t>
+      </w:r>
+    </w:p>
+    <w:p>
+      <w:r>
+        <w:t>子瑜想起清晨被男模盘着操的屈辱；舒华抚她后脑：‘跟那天不一样。你能叫停。’屈辱被改写成可选择的颤栗。羁绊是沉沦时还有人接住刹车。</w:t>
+      </w:r>
+    </w:p>
+    <w:p>
+      <w:r>
+        <w:t>手指力度每一次微调都牵动穴内吸吮：收紧时内壁绞死侵入物，松开时空气涌入、潮液喷溅。阴唇外翻又合拢，阴蒂肿亮；后穴若同时开拓，肉壁把力量传到小腹，又酸又甜。叶舒华在眼前发黑时仍抓周子瑜手腕确认‘人还在’；周子瑜被勒到发颤时仍用腿盘稳对方——既是情欲，也是守护。真迹让人上瘾失控；颈间契约却逼人练习控制。练习本身，比高潮更漫长，也更亲密。</w:t>
+      </w:r>
+    </w:p>
+    <w:p>
+      <w:r>
+        <w:t>男模只配充当节奏器。舒华手一抬他就要停。窒息开关在两人掌心，外人只是被借来的硬度。</w:t>
+      </w:r>
+    </w:p>
+    <w:p>
+      <w:r>
+        <w:t>手指力度每一次微调都牵动穴内吸吮：收紧时内壁绞死侵入物，松开时空气涌入、潮液喷溅。阴唇外翻又合拢，阴蒂肿亮；后穴若同时开拓，肉壁把力量传到小腹，又酸又甜。叶舒华在眼前发黑时仍抓周子瑜手腕确认‘人还在’；周子瑜被勒到发颤时仍用腿盘稳对方——既是情欲，也是守护。真迹让人上瘾失控；颈间契约却逼人练习控制。练习本身，比高潮更漫长，也更亲密。</w:t>
+      </w:r>
+    </w:p>
+    <w:p>
+      <w:r>
+        <w:t>潮吹在窒息边缘又长又凶。子瑜去时长腿痉挛盘死；舒华去时反咬子瑜肩膀盖章。精液在松开脖子大口喘气时被穴口挤出。</w:t>
+      </w:r>
+    </w:p>
+    <w:p>
+      <w:r>
+        <w:t>手指力度每一次微调都牵动穴内吸吮：收紧时内壁绞死侵入物，松开时空气涌入、潮液喷溅。阴唇外翻又合拢，阴蒂肿亮；后穴若同时开拓，肉壁把力量传到小腹，又酸又甜。叶舒华在眼前发黑时仍抓周子瑜手腕确认‘人还在’；周子瑜被勒到发颤时仍用腿盘稳对方——既是情欲，也是守护。真迹让人上瘾失控；颈间契约却逼人练习控制。练习本身，比高潮更漫长，也更亲密。</w:t>
+      </w:r>
+    </w:p>
+    <w:p>
+      <w:r>
+        <w:t>巡场伴舞第二次经过，听见三下拍肩，确定她们有安全动作，在群里打了又删：小镜室勿扰。</w:t>
+      </w:r>
+    </w:p>
+    <w:p>
+      <w:r>
+        <w:t>手指力度每一次微调都牵动穴内吸吮：收紧时内壁绞死侵入物，松开时空气涌入、潮液喷溅。阴唇外翻又合拢，阴蒂肿亮；后穴若同时开拓，肉壁把力量传到小腹，又酸又甜。叶舒华在眼前发黑时仍抓周子瑜手腕确认‘人还在’；周子瑜被勒到发颤时仍用腿盘稳对方——既是情欲，也是守护。真迹让人上瘾失控；颈间契约却逼人练习控制。练习本身，比高潮更漫长，也更亲密。</w:t>
+      </w:r>
+    </w:p>
+    <w:p>
+      <w:r>
+        <w:t>舒华问：‘如果我被真迹搞到不认识自己，你还会掐我吗？’子瑜：‘会。但只为了让你回气，不是为了让你坏掉。’舒华眼眶红了。</w:t>
+      </w:r>
+    </w:p>
+    <w:p>
+      <w:r>
+        <w:t>手指力度每一次微调都牵动穴内吸吮：收紧时内壁绞死侵入物，松开时空气涌入、潮液喷溅。阴唇外翻又合拢，阴蒂肿亮；后穴若同时开拓，肉壁把力量传到小腹，又酸又甜。叶舒华在眼前发黑时仍抓周子瑜手腕确认‘人还在’；周子瑜被勒到发颤时仍用腿盘稳对方——既是情欲，也是守护。真迹让人上瘾失控；颈间契约却逼人练习控制。练习本身，比高潮更漫长，也更亲密。</w:t>
+      </w:r>
+    </w:p>
+    <w:p>
+      <w:r>
+        <w:t>她们尝试叠息：接吻互夺呼吸，阴蒂相磨，颈侧青筋微现。分开时咳嗽又笑，上瘾的不是针剂，是对方的肺。</w:t>
+      </w:r>
+    </w:p>
+    <w:p>
+      <w:r>
+        <w:t>手指力度每一次微调都牵动穴内吸吮：收紧时内壁绞死侵入物，松开时空气涌入、潮液喷溅。阴唇外翻又合拢，阴蒂肿亮；后穴若同时开拓，肉壁把力量传到小腹，又酸又甜。叶舒华在眼前发黑时仍抓周子瑜手腕确认‘人还在’；周子瑜被勒到发颤时仍用腿盘稳对方——既是情欲，也是守护。真迹让人上瘾失控；颈间契约却逼人练习控制。练习本身，比高潮更漫长，也更亲密。</w:t>
+      </w:r>
+    </w:p>
+    <w:p>
+      <w:r>
+        <w:t>清洗时子瑜给舒华擦颈间红痕。舒华说：‘以后别一个人来地下。叫我。’子瑜把黑缎折好收进包里——不是战利品，是契约副本。</w:t>
+      </w:r>
+    </w:p>
+    <w:p>
+      <w:r>
+        <w:t>手指力度每一次微调都牵动穴内吸吮：收紧时内壁绞死侵入物，松开时空气涌入、潮液喷溅。阴唇外翻又合拢，阴蒂肿亮；后穴若同时开拓，肉壁把力量传到小腹，又酸又甜。叶舒华在眼前发黑时仍抓周子瑜手腕确认‘人还在’；周子瑜被勒到发颤时仍用腿盘稳对方——既是情欲，也是守护。真迹让人上瘾失控；颈间契约却逼人练习控制。练习本身，比高潮更漫长，也更亲密。</w:t>
+      </w:r>
+    </w:p>
+    <w:p>
+      <w:r>
+        <w:t>规则被重复确认三次：拍肩、唇色、意识。每一次确认都让穴里更湿——信任本身成为前戏。</w:t>
+      </w:r>
+    </w:p>
+    <w:p>
+      <w:r>
+        <w:t>手指力度每一次微调都牵动穴内吸吮：收紧时内壁绞死侵入物，松开时空气涌入、潮液喷溅。阴唇外翻又合拢，阴蒂肿亮；后穴若同时开拓，肉壁把力量传到小腹，又酸又甜。叶舒华在眼前发黑时仍抓周子瑜手腕确认‘人还在’；周子瑜被勒到发颤时仍用腿盘稳对方——既是情欲，也是守护。真迹让人上瘾失控；颈间契约却逼人练习控制。练习本身，比高潮更漫长，也更亲密。</w:t>
+      </w:r>
+    </w:p>
+    <w:p>
+      <w:r>
+        <w:t>舒华被勒到发颤时仍要命令：‘再深一点……气少一点……别停看我。’子瑜既要顶弄又要盯脉搏，像同时跳两支舞。</w:t>
+      </w:r>
+    </w:p>
+    <w:p>
+      <w:r>
+        <w:t>手指力度每一次微调都牵动穴内吸吮：收紧时内壁绞死侵入物，松开时空气涌入、潮液喷溅。阴唇外翻又合拢，阴蒂肿亮；后穴若同时开拓，肉壁把力量传到小腹，又酸又甜。叶舒华在眼前发黑时仍抓周子瑜手腕确认‘人还在’；周子瑜被勒到发颤时仍用腿盘稳对方——既是情欲，也是守护。真迹让人上瘾失控；颈间契约却逼人练习控制。练习本身，比高潮更漫长，也更亲密。</w:t>
+      </w:r>
+    </w:p>
+    <w:p>
+      <w:r>
+        <w:t>子瑜被勒时会本能盘腰。盘得越紧，进入越深，缺氧越把深度放大。她哭着仍数拍，数到该停就停，停得干脆，爱得也干脆。</w:t>
+      </w:r>
+    </w:p>
+    <w:p>
+      <w:r>
+        <w:t>手指力度每一次微调都牵动穴内吸吮：收紧时内壁绞死侵入物，松开时空气涌入、潮液喷溅。阴唇外翻又合拢，阴蒂肿亮；后穴若同时开拓，肉壁把力量传到小腹，又酸又甜。叶舒华在眼前发黑时仍抓周子瑜手腕确认‘人还在’；周子瑜被勒到发颤时仍用腿盘稳对方——既是情欲，也是守护。真迹让人上瘾失控；颈间契约却逼人练习控制。练习本身，比高潮更漫长，也更亲密。</w:t>
+      </w:r>
+    </w:p>
+    <w:p>
+      <w:r>
+        <w:t>两人交换角色后，权力并不倾斜：谁被掐，谁仍保有叫停权；谁下手，谁承担守护责任。这比真迹局里的‘被注射’干净得多，也危险得多。</w:t>
+      </w:r>
+    </w:p>
+    <w:p>
+      <w:r>
+        <w:t>手指力度每一次微调都牵动穴内吸吮：收紧时内壁绞死侵入物，松开时空气涌入、潮液喷溅。阴唇外翻又合拢，阴蒂肿亮；后穴若同时开拓，肉壁把力量传到小腹，又酸又甜。叶舒华在眼前发黑时仍抓周子瑜手腕确认‘人还在’；周子瑜被勒到发颤时仍用腿盘稳对方——既是情欲，也是守护。真迹让人上瘾失控；颈间契约却逼人练习控制。练习本身，比高潮更漫长，也更亲密。</w:t>
+      </w:r>
+    </w:p>
+    <w:p>
+      <w:r>
+        <w:t>结束时镜墙起雾。雾里两个模糊面孔靠在一起。门外潮水仍在翻涌；门内红痕渐退，关系更深一寸。</w:t>
+      </w:r>
+    </w:p>
+    <w:p>
+      <w:r>
+        <w:t>手指力度每一次微调都牵动穴内吸吮：收紧时内壁绞死侵入物，松开时空气涌入、潮液喷溅。阴唇外翻又合拢，阴蒂肿亮；后穴若同时开拓，肉壁把力量传到小腹，又酸又甜。叶舒华在眼前发黑时仍抓周子瑜手腕确认‘人还在’；周子瑜被勒到发颤时仍用腿盘稳对方——既是情欲，也是守护。真迹让人上瘾失控；颈间契约却逼人练习控制。练习本身，比高潮更漫长，也更亲密。</w:t>
+      </w:r>
+    </w:p>
+    <w:p>
+      <w:r>
+        <w:t>周子瑜在收紧手指前会先看叶舒华的眼睛。确认，再施力。舒华被看得烦，却又上瘾——被认真对待的感觉，比被填满更罕见。</w:t>
+      </w:r>
+    </w:p>
+    <w:p>
+      <w:r>
+        <w:t>手指力度每一次微调都牵动穴内吸吮：收紧时内壁绞死侵入物，松开时空气涌入、潮液喷溅。阴唇外翻又合拢，阴蒂肿亮；后穴若同时开拓，肉壁把力量传到小腹，又酸又甜。叶舒华在眼前发黑时仍抓周子瑜手腕确认‘人还在’；周子瑜被勒到发颤时仍用腿盘稳对方——既是情欲，也是守护。真迹让人上瘾失控；颈间契约却逼人练习控制。练习本身，比高潮更漫长，也更亲密。</w:t>
+      </w:r>
+    </w:p>
+    <w:p>
+      <w:r>
+        <w:t>缺氧对子瑜而言像关掉全世界的声音，只剩穴里被顶弄的清晰；对舒华而言像砸裂冷感外壳，露出只会叫、只会夹的芯。</w:t>
+      </w:r>
+    </w:p>
+    <w:p>
+      <w:r>
+        <w:t>手指力度每一次微调都牵动穴内吸吮：收紧时内壁绞死侵入物，松开时空气涌入、潮液喷溅。阴唇外翻又合拢，阴蒂肿亮；后穴若同时开拓，肉壁把力量传到小腹，又酸又甜。叶舒华在眼前发黑时仍抓周子瑜手腕确认‘人还在’；周子瑜被勒到发颤时仍用腿盘稳对方——既是情欲，也是守护。真迹让人上瘾失控；颈间契约却逼人练习控制。练习本身，比高潮更漫长，也更亲密。</w:t>
+      </w:r>
+    </w:p>
+    <w:p>
+      <w:r>
+        <w:t>丝带勒进侧颈时皮肤先白后红。舒华指导避开气管：‘我要眼前发黑，不是咳嗽。’子瑜手劲稳得像控腿，舒华穴口立刻喷出一小股水。</w:t>
+      </w:r>
+    </w:p>
+    <w:p>
+      <w:r>
+        <w:t>手指力度每一次微调都牵动穴内吸吮：收紧时内壁绞死侵入物，松开时空气涌入、潮液喷溅。阴唇外翻又合拢，阴蒂肿亮；后穴若同时开拓，肉壁把力量传到小腹，又酸又甜。叶舒华在眼前发黑时仍抓周子瑜手腕确认‘人还在’；周子瑜被勒到发颤时仍用腿盘稳对方——既是情欲，也是守护。真迹让人上瘾失控；颈间契约却逼人练习控制。练习本身，比高潮更漫长，也更亲密。</w:t>
+      </w:r>
+    </w:p>
+    <w:p>
+      <w:r>
+        <w:t>子瑜想起清晨被男模盘着操的屈辱；舒华抚她后脑：‘跟那天不一样。你能叫停。’屈辱被改写成可选择的颤栗。羁绊是沉沦时还有人接住刹车。</w:t>
+      </w:r>
+    </w:p>
+    <w:p>
+      <w:r>
+        <w:t>手指力度每一次微调都牵动穴内吸吮：收紧时内壁绞死侵入物，松开时空气涌入、潮液喷溅。阴唇外翻又合拢，阴蒂肿亮；后穴若同时开拓，肉壁把力量传到小腹，又酸又甜。叶舒华在眼前发黑时仍抓周子瑜手腕确认‘人还在’；周子瑜被勒到发颤时仍用腿盘稳对方——既是情欲，也是守护。真迹让人上瘾失控；颈间契约却逼人练习控制。练习本身，比高潮更漫长，也更亲密。</w:t>
+      </w:r>
+    </w:p>
+    <w:p>
+      <w:r>
+        <w:t>男模只配充当节奏器。舒华手一抬他就要停。窒息开关在两人掌心，外人只是被借来的硬度。</w:t>
+      </w:r>
+    </w:p>
+    <w:p>
+      <w:r>
+        <w:t>手指力度每一次微调都牵动穴内吸吮：收紧时内壁绞死侵入物，松开时空气涌入、潮液喷溅。阴唇外翻又合拢，阴蒂肿亮；后穴若同时开拓，肉壁把力量传到小腹，又酸又甜。叶舒华在眼前发黑时仍抓周子瑜手腕确认‘人还在’；周子瑜被勒到发颤时仍用腿盘稳对方——既是情欲，也是守护。真迹让人上瘾失控；颈间契约却逼人练习控制。练习本身，比高潮更漫长，也更亲密。</w:t>
+      </w:r>
+    </w:p>
+    <w:p>
+      <w:r>
+        <w:t>潮吹在窒息边缘又长又凶。子瑜去时长腿痉挛盘死；舒华去时反咬子瑜肩膀盖章。精液在松开脖子大口喘气时被穴口挤出。</w:t>
+      </w:r>
+    </w:p>
+    <w:p>
+      <w:r>
+        <w:t>手指力度每一次微调都牵动穴内吸吮：收紧时内壁绞死侵入物，松开时空气涌入、潮液喷溅。阴唇外翻又合拢，阴蒂肿亮；后穴若同时开拓，肉壁把力量传到小腹，又酸又甜。叶舒华在眼前发黑时仍抓周子瑜手腕确认‘人还在’；周子瑜被勒到发颤时仍用腿盘稳对方——既是情欲，也是守护。真迹让人上瘾失控；颈间契约却逼人练习控制。练习本身，比高潮更漫长，也更亲密。</w:t>
+      </w:r>
+    </w:p>
+    <w:p>
+      <w:r>
+        <w:t>巡场伴舞第二次经过，听见三下拍肩，确定她们有安全动作，在群里打了又删：小镜室勿扰。</w:t>
+      </w:r>
+    </w:p>
+    <w:p>
+      <w:r>
+        <w:t>手指力度每一次微调都牵动穴内吸吮：收紧时内壁绞死侵入物，松开时空气涌入、潮液喷溅。阴唇外翻又合拢，阴蒂肿亮；后穴若同时开拓，肉壁把力量传到小腹，又酸又甜。叶舒华在眼前发黑时仍抓周子瑜手腕确认‘人还在’；周子瑜被勒到发颤时仍用腿盘稳对方——既是情欲，也是守护。真迹让人上瘾失控；颈间契约却逼人练习控制。练习本身，比高潮更漫长，也更亲密。</w:t>
+      </w:r>
+    </w:p>
+    <w:p>
+      <w:r>
+        <w:t>舒华问：‘如果我被真迹搞到不认识自己，你还会掐我吗？’子瑜：‘会。但只为了让你回气，不是为了让你坏掉。’舒华眼眶红了。</w:t>
+      </w:r>
+    </w:p>
+    <w:p>
+      <w:r>
+        <w:t>手指力度每一次微调都牵动穴内吸吮：收紧时内壁绞死侵入物，松开时空气涌入、潮液喷溅。阴唇外翻又合拢，阴蒂肿亮；后穴若同时开拓，肉壁把力量传到小腹，又酸又甜。叶舒华在眼前发黑时仍抓周子瑜手腕确认‘人还在’；周子瑜被勒到发颤时仍用腿盘稳对方——既是情欲，也是守护。真迹让人上瘾失控；颈间契约却逼人练习控制。练习本身，比高潮更漫长，也更亲密。</w:t>
+      </w:r>
+    </w:p>
+    <w:p>
+      <w:r>
+        <w:t>她们尝试叠息：接吻互夺呼吸，阴蒂相磨，颈侧青筋微现。分开时咳嗽又笑，上瘾的不是针剂，是对方的肺。</w:t>
+      </w:r>
+    </w:p>
+    <w:p>
+      <w:r>
+        <w:t>手指力度每一次微调都牵动穴内吸吮：收紧时内壁绞死侵入物，松开时空气涌入、潮液喷溅。阴唇外翻又合拢，阴蒂肿亮；后穴若同时开拓，肉壁把力量传到小腹，又酸又甜。叶舒华在眼前发黑时仍抓周子瑜手腕确认‘人还在’；周子瑜被勒到发颤时仍用腿盘稳对方——既是情欲，也是守护。真迹让人上瘾失控；颈间契约却逼人练习控制。练习本身，比高潮更漫长，也更亲密。</w:t>
+      </w:r>
+    </w:p>
+    <w:p>
+      <w:r>
+        <w:t>清洗时子瑜给舒华擦颈间红痕。舒华说：‘以后别一个人来地下。叫我。’子瑜把黑缎折好收进包里——不是战利品，是契约副本。</w:t>
+      </w:r>
+    </w:p>
+    <w:p>
+      <w:r>
+        <w:t>手指力度每一次微调都牵动穴内吸吮：收紧时内壁绞死侵入物，松开时空气涌入、潮液喷溅。阴唇外翻又合拢，阴蒂肿亮；后穴若同时开拓，肉壁把力量传到小腹，又酸又甜。叶舒华在眼前发黑时仍抓周子瑜手腕确认‘人还在’；周子瑜被勒到发颤时仍用腿盘稳对方——既是情欲，也是守护。真迹让人上瘾失控；颈间契约却逼人练习控制。练习本身，比高潮更漫长，也更亲密。</w:t>
+      </w:r>
+    </w:p>
+    <w:p>
+      <w:r>
+        <w:t>规则被重复确认三次：拍肩、唇色、意识。每一次确认都让穴里更湿——信任本身成为前戏。</w:t>
+      </w:r>
+    </w:p>
+    <w:p>
+      <w:r>
+        <w:t>手指力度每一次微调都牵动穴内吸吮：收紧时内壁绞死侵入物，松开时空气涌入、潮液喷溅。阴唇外翻又合拢，阴蒂肿亮；后穴若同时开拓，肉壁把力量传到小腹，又酸又甜。叶舒华在眼前发黑时仍抓周子瑜手腕确认‘人还在’；周子瑜被勒到发颤时仍用腿盘稳对方——既是情欲，也是守护。真迹让人上瘾失控；颈间契约却逼人练习控制。练习本身，比高潮更漫长，也更亲密。</w:t>
+      </w:r>
+    </w:p>
+    <w:p>
+      <w:r>
+        <w:t>舒华被勒到发颤时仍要命令：‘再深一点……气少一点……别停看我。’子瑜既要顶弄又要盯脉搏，像同时跳两支舞。</w:t>
+      </w:r>
+    </w:p>
+    <w:p>
+      <w:r>
+        <w:t>手指力度每一次微调都牵动穴内吸吮：收紧时内壁绞死侵入物，松开时空气涌入、潮液喷溅。阴唇外翻又合拢，阴蒂肿亮；后穴若同时开拓，肉壁把力量传到小腹，又酸又甜。叶舒华在眼前发黑时仍抓周子瑜手腕确认‘人还在’；周子瑜被勒到发颤时仍用腿盘稳对方——既是情欲，也是守护。真迹让人上瘾失控；颈间契约却逼人练习控制。练习本身，比高潮更漫长，也更亲密。</w:t>
+      </w:r>
+    </w:p>
+    <w:p>
+      <w:r>
+        <w:t>子瑜被勒时会本能盘腰。盘得越紧，进入越深，缺氧越把深度放大。她哭着仍数拍，数到该停就停，停得干脆，爱得也干脆。</w:t>
+      </w:r>
+    </w:p>
+    <w:p>
+      <w:r>
+        <w:t>手指力度每一次微调都牵动穴内吸吮：收紧时内壁绞死侵入物，松开时空气涌入、潮液喷溅。阴唇外翻又合拢，阴蒂肿亮；后穴若同时开拓，肉壁把力量传到小腹，又酸又甜。叶舒华在眼前发黑时仍抓周子瑜手腕确认‘人还在’；周子瑜被勒到发颤时仍用腿盘稳对方——既是情欲，也是守护。真迹让人上瘾失控；颈间契约却逼人练习控制。练习本身，比高潮更漫长，也更亲密。</w:t>
+      </w:r>
+    </w:p>
+    <w:p>
+      <w:r>
+        <w:t>两人交换角色后，权力并不倾斜：谁被掐，谁仍保有叫停权；谁下手，谁承担守护责任。这比真迹局里的‘被注射’干净得多，也危险得多。</w:t>
+      </w:r>
+    </w:p>
+    <w:p>
+      <w:r>
+        <w:t>手指力度每一次微调都牵动穴内吸吮：收紧时内壁绞死侵入物，松开时空气涌入、潮液喷溅。阴唇外翻又合拢，阴蒂肿亮；后穴若同时开拓，肉壁把力量传到小腹，又酸又甜。叶舒华在眼前发黑时仍抓周子瑜手腕确认‘人还在’；周子瑜被勒到发颤时仍用腿盘稳对方——既是情欲，也是守护。真迹让人上瘾失控；颈间契约却逼人练习控制。练习本身，比高潮更漫长，也更亲密。</w:t>
+      </w:r>
+    </w:p>
+    <w:p>
+      <w:r>
+        <w:t>结束时镜墙起雾。雾里两个模糊面孔靠在一起。门外潮水仍在翻涌；门内红痕渐退，关系更深一寸。</w:t>
+      </w:r>
+    </w:p>
+    <w:p>
+      <w:r>
+        <w:t>手指力度每一次微调都牵动穴内吸吮：收紧时内壁绞死侵入物，松开时空气涌入、潮液喷溅。阴唇外翻又合拢，阴蒂肿亮；后穴若同时开拓，肉壁把力量传到小腹，又酸又甜。叶舒华在眼前发黑时仍抓周子瑜手腕确认‘人还在’；周子瑜被勒到发颤时仍用腿盘稳对方——既是情欲，也是守护。真迹让人上瘾失控；颈间契约却逼人练习控制。练习本身，比高潮更漫长，也更亲密。</w:t>
+      </w:r>
+    </w:p>
+    <w:p>
+      <w:r>
+        <w:t>周子瑜在收紧手指前会先看叶舒华的眼睛。确认，再施力。舒华被看得烦，却又上瘾——被认真对待的感觉，比被填满更罕见。</w:t>
+      </w:r>
+    </w:p>
+    <w:p>
+      <w:r>
+        <w:t>手指力度每一次微调都牵动穴内吸吮：收紧时内壁绞死侵入物，松开时空气涌入、潮液喷溅。阴唇外翻又合拢，阴蒂肿亮；后穴若同时开拓，肉壁把力量传到小腹，又酸又甜。叶舒华在眼前发黑时仍抓周子瑜手腕确认‘人还在’；周子瑜被勒到发颤时仍用腿盘稳对方——既是情欲，也是守护。真迹让人上瘾失控；颈间契约却逼人练习控制。练习本身，比高潮更漫长，也更亲密。</w:t>
+      </w:r>
+    </w:p>
+    <w:p>
+      <w:r>
+        <w:t>缺氧对子瑜而言像关掉全世界的声音，只剩穴里被顶弄的清晰；对舒华而言像砸裂冷感外壳，露出只会叫、只会夹的芯。</w:t>
+      </w:r>
+    </w:p>
+    <w:p>
+      <w:r>
+        <w:t>手指力度每一次微调都牵动穴内吸吮：收紧时内壁绞死侵入物，松开时空气涌入、潮液喷溅。阴唇外翻又合拢，阴蒂肿亮；后穴若同时开拓，肉壁把力量传到小腹，又酸又甜。叶舒华在眼前发黑时仍抓周子瑜手腕确认‘人还在’；周子瑜被勒到发颤时仍用腿盘稳对方——既是情欲，也是守护。真迹让人上瘾失控；颈间契约却逼人练习控制。练习本身，比高潮更漫长，也更亲密。</w:t>
+      </w:r>
+    </w:p>
+    <w:p>
+      <w:r>
+        <w:t>丝带勒进侧颈时皮肤先白后红。舒华指导避开气管：‘我要眼前发黑，不是咳嗽。’子瑜手劲稳得像控腿，舒华穴口立刻喷出一小股水。</w:t>
+      </w:r>
+    </w:p>
+    <w:p>
+      <w:r>
+        <w:t>手指力度每一次微调都牵动穴内吸吮：收紧时内壁绞死侵入物，松开时空气涌入、潮液喷溅。阴唇外翻又合拢，阴蒂肿亮；后穴若同时开拓，肉壁把力量传到小腹，又酸又甜。叶舒华在眼前发黑时仍抓周子瑜手腕确认‘人还在’；周子瑜被勒到发颤时仍用腿盘稳对方——既是情欲，也是守护。真迹让人上瘾失控；颈间契约却逼人练习控制。练习本身，比高潮更漫长，也更亲密。</w:t>
+      </w:r>
+    </w:p>
+    <w:p>
+      <w:r>
+        <w:t>子瑜想起清晨被男模盘着操的屈辱；舒华抚她后脑：‘跟那天不一样。你能叫停。’屈辱被改写成可选择的颤栗。羁绊是沉沦时还有人接住刹车。</w:t>
+      </w:r>
+    </w:p>
+    <w:p>
+      <w:r>
+        <w:t>手指力度每一次微调都牵动穴内吸吮：收紧时内壁绞死侵入物，松开时空气涌入、潮液喷溅。阴唇外翻又合拢，阴蒂肿亮；后穴若同时开拓，肉壁把力量传到小腹，又酸又甜。叶舒华在眼前发黑时仍抓周子瑜手腕确认‘人还在’；周子瑜被勒到发颤时仍用腿盘稳对方——既是情欲，也是守护。真迹让人上瘾失控；颈间契约却逼人练习控制。练习本身，比高潮更漫长，也更亲密。</w:t>
+      </w:r>
+    </w:p>
+    <w:p>
+      <w:r>
+        <w:t>男模只配充当节奏器。舒华手一抬他就要停。窒息开关在两人掌心，外人只是被借来的硬度。</w:t>
+      </w:r>
+    </w:p>
+    <w:p>
+      <w:r>
+        <w:t>手指力度每一次微调都牵动穴内吸吮：收紧时内壁绞死侵入物，松开时空气涌入、潮液喷溅。阴唇外翻又合拢，阴蒂肿亮；后穴若同时开拓，肉壁把力量传到小腹，又酸又甜。叶舒华在眼前发黑时仍抓周子瑜手腕确认‘人还在’；周子瑜被勒到发颤时仍用腿盘稳对方——既是情欲，也是守护。真迹让人上瘾失控；颈间契约却逼人练习控制。练习本身，比高潮更漫长，也更亲密。</w:t>
+      </w:r>
+    </w:p>
+    <w:p>
+      <w:r>
+        <w:t>潮吹在窒息边缘又长又凶。子瑜去时长腿痉挛盘死；舒华去时反咬子瑜肩膀盖章。精液在松开脖子大口喘气时被穴口挤出。</w:t>
+      </w:r>
+    </w:p>
+    <w:p>
+      <w:r>
+        <w:t>手指力度每一次微调都牵动穴内吸吮：收紧时内壁绞死侵入物，松开时空气涌入、潮液喷溅。阴唇外翻又合拢，阴蒂肿亮；后穴若同时开拓，肉壁把力量传到小腹，又酸又甜。叶舒华在眼前发黑时仍抓周子瑜手腕确认‘人还在’；周子瑜被勒到发颤时仍用腿盘稳对方——既是情欲，也是守护。真迹让人上瘾失控；颈间契约却逼人练习控制。练习本身，比高潮更漫长，也更亲密。</w:t>
+      </w:r>
+    </w:p>
+    <w:p>
+      <w:r>
+        <w:t>巡场伴舞第二次经过，听见三下拍肩，确定她们有安全动作，在群里打了又删：小镜室勿扰。</w:t>
+      </w:r>
+    </w:p>
+    <w:p>
+      <w:r>
+        <w:t>手指力度每一次微调都牵动穴内吸吮：收紧时内壁绞死侵入物，松开时空气涌入、潮液喷溅。阴唇外翻又合拢，阴蒂肿亮；后穴若同时开拓，肉壁把力量传到小腹，又酸又甜。叶舒华在眼前发黑时仍抓周子瑜手腕确认‘人还在’；周子瑜被勒到发颤时仍用腿盘稳对方——既是情欲，也是守护。真迹让人上瘾失控；颈间契约却逼人练习控制。练习本身，比高潮更漫长，也更亲密。</w:t>
+      </w:r>
+    </w:p>
+    <w:p>
+      <w:r>
+        <w:t>舒华问：‘如果我被真迹搞到不认识自己，你还会掐我吗？’子瑜：‘会。但只为了让你回气，不是为了让你坏掉。’舒华眼眶红了。</w:t>
+      </w:r>
+    </w:p>
+    <w:p>
+      <w:r>
+        <w:t>手指力度每一次微调都牵动穴内吸吮：收紧时内壁绞死侵入物，松开时空气涌入、潮液喷溅。阴唇外翻又合拢，阴蒂肿亮；后穴若同时开拓，肉壁把力量传到小腹，又酸又甜。叶舒华在眼前发黑时仍抓周子瑜手腕确认‘人还在’；周子瑜被勒到发颤时仍用腿盘稳对方——既是情欲，也是守护。真迹让人上瘾失控；颈间契约却逼人练习控制。练习本身，比高潮更漫长，也更亲密。</w:t>
+      </w:r>
+    </w:p>
+    <w:p>
+      <w:r>
+        <w:t>她们尝试叠息：接吻互夺呼吸，阴蒂相磨，颈侧青筋微现。分开时咳嗽又笑，上瘾的不是针剂，是对方的肺。</w:t>
+      </w:r>
+    </w:p>
+    <w:p>
+      <w:r>
+        <w:t>手指力度每一次微调都牵动穴内吸吮：收紧时内壁绞死侵入物，松开时空气涌入、潮液喷溅。阴唇外翻又合拢，阴蒂肿亮；后穴若同时开拓，肉壁把力量传到小腹，又酸又甜。叶舒华在眼前发黑时仍抓周子瑜手腕确认‘人还在’；周子瑜被勒到发颤时仍用腿盘稳对方——既是情欲，也是守护。真迹让人上瘾失控；颈间契约却逼人练习控制。练习本身，比高潮更漫长，也更亲密。</w:t>
+      </w:r>
+    </w:p>
+    <w:p>
+      <w:r>
+        <w:t>清洗时子瑜给舒华擦颈间红痕。舒华说：‘以后别一个人来地下。叫我。’子瑜把黑缎折好收进包里——不是战利品，是契约副本。</w:t>
+      </w:r>
+    </w:p>
+    <w:p>
+      <w:r>
+        <w:t>手指力度每一次微调都牵动穴内吸吮：收紧时内壁绞死侵入物，松开时空气涌入、潮液喷溅。阴唇外翻又合拢，阴蒂肿亮；后穴若同时开拓，肉壁把力量传到小腹，又酸又甜。叶舒华在眼前发黑时仍抓周子瑜手腕确认‘人还在’；周子瑜被勒到发颤时仍用腿盘稳对方——既是情欲，也是守护。真迹让人上瘾失控；颈间契约却逼人练习控制。练习本身，比高潮更漫长，也更亲密。</w:t>
+      </w:r>
+    </w:p>
+    <w:p>
+      <w:r>
+        <w:t>规则被重复确认三次：拍肩、唇色、意识。每一次确认都让穴里更湿——信任本身成为前戏。</w:t>
+      </w:r>
+    </w:p>
+    <w:p>
+      <w:r>
+        <w:t>手指力度每一次微调都牵动穴内吸吮：收紧时内壁绞死侵入物，松开时空气涌入、潮液喷溅。阴唇外翻又合拢，阴蒂肿亮；后穴若同时开拓，肉壁把力量传到小腹，又酸又甜。叶舒华在眼前发黑时仍抓周子瑜手腕确认‘人还在’；周子瑜被勒到发颤时仍用腿盘稳对方——既是情欲，也是守护。真迹让人上瘾失控；颈间契约却逼人练习控制。练习本身，比高潮更漫长，也更亲密。</w:t>
+      </w:r>
+    </w:p>
+    <w:p>
+      <w:r>
+        <w:t>舒华被勒到发颤时仍要命令：‘再深一点……气少一点……别停看我。’子瑜既要顶弄又要盯脉搏，像同时跳两支舞。</w:t>
+      </w:r>
+    </w:p>
+    <w:p>
+      <w:r>
+        <w:t>手指力度每一次微调都牵动穴内吸吮：收紧时内壁绞死侵入物，松开时空气涌入、潮液喷溅。阴唇外翻又合拢，阴蒂肿亮；后穴若同时开拓，肉壁把力量传到小腹，又酸又甜。叶舒华在眼前发黑时仍抓周子瑜手腕确认‘人还在’；周子瑜被勒到发颤时仍用腿盘稳对方——既是情欲，也是守护。真迹让人上瘾失控；颈间契约却逼人练习控制。练习本身，比高潮更漫长，也更亲密。</w:t>
+      </w:r>
+    </w:p>
+    <w:p>
+      <w:r>
+        <w:t>子瑜被勒时会本能盘腰。盘得越紧，进入越深，缺氧越把深度放大。她哭着仍数拍，数到该停就停，停得干脆，爱得也干脆。</w:t>
+      </w:r>
+    </w:p>
+    <w:p>
+      <w:r>
+        <w:t>手指力度每一次微调都牵动穴内吸吮：收紧时内壁绞死侵入物，松开时空气涌入、潮液喷溅。阴唇外翻又合拢，阴蒂肿亮；后穴若同时开拓，肉壁把力量传到小腹，又酸又甜。叶舒华在眼前发黑时仍抓周子瑜手腕确认‘人还在’；周子瑜被勒到发颤时仍用腿盘稳对方——既是情欲，也是守护。真迹让人上瘾失控；颈间契约却逼人练习控制。练习本身，比高潮更漫长，也更亲密。</w:t>
       </w:r>
     </w:p>
     <w:sectPr>

</xml_diff>